<commit_message>
docs: update comprehensive user guide and Word documents with multi-sheet Excel ingestion, resilient cleaning engine, and high-contrast typography
</commit_message>
<xml_diff>
--- a/OmniDash_Email_Package/OmniDash_Executive_User_Guide.docx
+++ b/OmniDash_Email_Package/OmniDash_Executive_User_Guide.docx
@@ -805,7 +805,7 @@
           <w:color w:val="1E293B"/>
           <w:sz w:val="20"/>
         </w:rPr>
-        <w:t xml:space="preserve"> (.xlsx, .xls): Automatically extracts the primary worksheet with multi-tab selection support.</w:t>
+        <w:t xml:space="preserve"> (.xlsx, .xls, .xlsm, .xlsb): Full support for multi-worksheet workbooks, macro-enabled spreadsheets, and compressed binary workbooks with automated sheet discovery.</w:t>
       </w:r>
     </w:p>
     <w:p>
@@ -857,15 +857,15 @@
           <w:color w:val="1E293B"/>
           <w:sz w:val="20"/>
         </w:rPr>
-        <w:t>Structured JSON</w:t>
-      </w:r>
-      <w:r>
-        <w:rPr>
-          <w:rFonts w:ascii="Calibri" w:hAnsi="Calibri"/>
-          <w:color w:val="1E293B"/>
-          <w:sz w:val="20"/>
-        </w:rPr>
-        <w:t xml:space="preserve"> (.json): Flattens array-of-objects schemas automatically into clean tabular formats.</w:t>
+        <w:t>Word Documents</w:t>
+      </w:r>
+      <w:r>
+        <w:rPr>
+          <w:rFonts w:ascii="Calibri" w:hAnsi="Calibri"/>
+          <w:color w:val="1E293B"/>
+          <w:sz w:val="20"/>
+        </w:rPr>
+        <w:t xml:space="preserve"> (.docx): Automatically extracts embedded tables and structured data matrices from Word documents.</w:t>
       </w:r>
     </w:p>
     <w:p>
@@ -887,19 +887,79 @@
           <w:color w:val="1E293B"/>
           <w:sz w:val="20"/>
         </w:rPr>
-        <w:t>PDF Reports</w:t>
-      </w:r>
-      <w:r>
-        <w:rPr>
-          <w:rFonts w:ascii="Calibri" w:hAnsi="Calibri"/>
-          <w:color w:val="1E293B"/>
-          <w:sz w:val="20"/>
-        </w:rPr>
-        <w:t xml:space="preserve"> (.pdf): Scans structured text tables from PDF documents and transforms them into analytical datasets.</w:t>
+        <w:t>PowerPoint Presentations</w:t>
+      </w:r>
+      <w:r>
+        <w:rPr>
+          <w:rFonts w:ascii="Calibri" w:hAnsi="Calibri"/>
+          <w:color w:val="1E293B"/>
+          <w:sz w:val="20"/>
+        </w:rPr>
+        <w:t xml:space="preserve"> (.pptx): Extracts embedded slide tables and OpenXML data sheets.</w:t>
       </w:r>
     </w:p>
     <w:p>
       <w:pPr>
+        <w:pStyle w:val="ListBullet"/>
+        <w:spacing w:before="20" w:after="40" w:line="276" w:lineRule="auto"/>
+      </w:pPr>
+      <w:r>
+        <w:rPr>
+          <w:rFonts w:ascii="Calibri" w:hAnsi="Calibri"/>
+          <w:color w:val="1E293B"/>
+          <w:sz w:val="20"/>
+        </w:rPr>
+      </w:r>
+      <w:r>
+        <w:rPr>
+          <w:rFonts w:ascii="Calibri" w:hAnsi="Calibri"/>
+          <w:b/>
+          <w:color w:val="1E293B"/>
+          <w:sz w:val="20"/>
+        </w:rPr>
+        <w:t>PDF Reports</w:t>
+      </w:r>
+      <w:r>
+        <w:rPr>
+          <w:rFonts w:ascii="Calibri" w:hAnsi="Calibri"/>
+          <w:color w:val="1E293B"/>
+          <w:sz w:val="20"/>
+        </w:rPr>
+        <w:t xml:space="preserve"> (.pdf): Scans structured text tables from PDF documents and transforms them into analytical datasets.</w:t>
+      </w:r>
+    </w:p>
+    <w:p>
+      <w:pPr>
+        <w:pStyle w:val="ListBullet"/>
+        <w:spacing w:before="20" w:after="40" w:line="276" w:lineRule="auto"/>
+      </w:pPr>
+      <w:r>
+        <w:rPr>
+          <w:rFonts w:ascii="Calibri" w:hAnsi="Calibri"/>
+          <w:color w:val="1E293B"/>
+          <w:sz w:val="20"/>
+        </w:rPr>
+      </w:r>
+      <w:r>
+        <w:rPr>
+          <w:rFonts w:ascii="Calibri" w:hAnsi="Calibri"/>
+          <w:b/>
+          <w:color w:val="1E293B"/>
+          <w:sz w:val="20"/>
+        </w:rPr>
+        <w:t>Structured JSON</w:t>
+      </w:r>
+      <w:r>
+        <w:rPr>
+          <w:rFonts w:ascii="Calibri" w:hAnsi="Calibri"/>
+          <w:color w:val="1E293B"/>
+          <w:sz w:val="20"/>
+        </w:rPr>
+        <w:t xml:space="preserve"> (.json): Flattens array-of-objects schemas automatically into clean tabular formats.</w:t>
+      </w:r>
+    </w:p>
+    <w:p>
+      <w:pPr>
         <w:keepNext/>
         <w:spacing w:before="280" w:after="80"/>
       </w:pPr>
@@ -910,7 +970,635 @@
           <w:color w:val="1E293B"/>
           <w:sz w:val="25"/>
         </w:rPr>
-        <w:t>2.2 Built-In Sample Datasets</w:t>
+        <w:t>2.2 Multi-Worksheet Recognition &amp; Ingestion</w:t>
+      </w:r>
+    </w:p>
+    <w:p>
+      <w:pPr>
+        <w:spacing w:before="40" w:after="120" w:line="288" w:lineRule="auto"/>
+      </w:pPr>
+      <w:r>
+        <w:rPr>
+          <w:rFonts w:ascii="Calibri" w:hAnsi="Calibri"/>
+          <w:color w:val="334155"/>
+          <w:sz w:val="20"/>
+        </w:rPr>
+        <w:t>When an Excel workbook containing multiple worksheets is uploaded, OmniDash eliminates the limitation of defaulting solely to the first tab:</w:t>
+      </w:r>
+    </w:p>
+    <w:p>
+      <w:pPr>
+        <w:pStyle w:val="ListBullet"/>
+        <w:spacing w:before="20" w:after="40" w:line="276" w:lineRule="auto"/>
+      </w:pPr>
+      <w:r>
+        <w:rPr>
+          <w:rFonts w:ascii="Calibri" w:hAnsi="Calibri"/>
+          <w:color w:val="1E293B"/>
+          <w:sz w:val="20"/>
+        </w:rPr>
+      </w:r>
+      <w:r>
+        <w:rPr>
+          <w:rFonts w:ascii="Calibri" w:hAnsi="Calibri"/>
+          <w:b/>
+          <w:color w:val="1E293B"/>
+          <w:sz w:val="20"/>
+        </w:rPr>
+        <w:t>Interactive Worksheet Selection</w:t>
+      </w:r>
+      <w:r>
+        <w:rPr>
+          <w:rFonts w:ascii="Calibri" w:hAnsi="Calibri"/>
+          <w:color w:val="1E293B"/>
+          <w:sz w:val="20"/>
+        </w:rPr>
+        <w:t xml:space="preserve">: An interactive </w:t>
+      </w:r>
+      <w:r>
+        <w:rPr>
+          <w:rFonts w:ascii="Calibri" w:hAnsi="Calibri"/>
+          <w:b/>
+          <w:color w:val="1E293B"/>
+          <w:sz w:val="20"/>
+        </w:rPr>
+        <w:t>Worksheet Navigation Bar</w:t>
+      </w:r>
+      <w:r>
+        <w:rPr>
+          <w:rFonts w:ascii="Calibri" w:hAnsi="Calibri"/>
+          <w:color w:val="1E293B"/>
+          <w:sz w:val="20"/>
+        </w:rPr>
+        <w:t xml:space="preserve"> appears inside the Upload Modal, displaying each sheet's name and estimated row count (e.g. 📄 Q1 Sales (~1,420 rows), 📄 Dim_Customers (~320 rows)).</w:t>
+      </w:r>
+    </w:p>
+    <w:p>
+      <w:pPr>
+        <w:pStyle w:val="ListBullet"/>
+        <w:spacing w:before="20" w:after="40" w:line="276" w:lineRule="auto"/>
+      </w:pPr>
+      <w:r>
+        <w:rPr>
+          <w:rFonts w:ascii="Calibri" w:hAnsi="Calibri"/>
+          <w:color w:val="1E293B"/>
+          <w:sz w:val="20"/>
+        </w:rPr>
+      </w:r>
+      <w:r>
+        <w:rPr>
+          <w:rFonts w:ascii="Calibri" w:hAnsi="Calibri"/>
+          <w:b/>
+          <w:color w:val="1E293B"/>
+          <w:sz w:val="20"/>
+        </w:rPr>
+        <w:t>Live Sheet Switching</w:t>
+      </w:r>
+      <w:r>
+        <w:rPr>
+          <w:rFonts w:ascii="Calibri" w:hAnsi="Calibri"/>
+          <w:color w:val="1E293B"/>
+          <w:sz w:val="20"/>
+        </w:rPr>
+        <w:t>: Clicking any worksheet tab immediately switches the preview table and statistical column profiles in real time without re-reading the file from disk.</w:t>
+      </w:r>
+    </w:p>
+    <w:p>
+      <w:pPr>
+        <w:pStyle w:val="ListBullet"/>
+        <w:spacing w:before="20" w:after="40" w:line="276" w:lineRule="auto"/>
+      </w:pPr>
+      <w:r>
+        <w:rPr>
+          <w:rFonts w:ascii="Calibri" w:hAnsi="Calibri"/>
+          <w:color w:val="1E293B"/>
+          <w:sz w:val="20"/>
+        </w:rPr>
+      </w:r>
+      <w:r>
+        <w:rPr>
+          <w:rFonts w:ascii="Calibri" w:hAnsi="Calibri"/>
+          <w:b/>
+          <w:color w:val="1E293B"/>
+          <w:sz w:val="20"/>
+        </w:rPr>
+        <w:t>"Union All Sheets" Action</w:t>
+      </w:r>
+      <w:r>
+        <w:rPr>
+          <w:rFonts w:ascii="Calibri" w:hAnsi="Calibri"/>
+          <w:color w:val="1E293B"/>
+          <w:sz w:val="20"/>
+        </w:rPr>
+        <w:t xml:space="preserve">: For files partitioned into time slices or regional tabs (e.g., Q1, Q2, Q3, Q4), a single click on </w:t>
+      </w:r>
+      <w:r>
+        <w:rPr>
+          <w:rFonts w:ascii="Calibri" w:hAnsi="Calibri"/>
+          <w:b/>
+          <w:color w:val="1E293B"/>
+          <w:sz w:val="20"/>
+        </w:rPr>
+        <w:t>Union All Sheets</w:t>
+      </w:r>
+      <w:r>
+        <w:rPr>
+          <w:rFonts w:ascii="Calibri" w:hAnsi="Calibri"/>
+          <w:color w:val="1E293B"/>
+          <w:sz w:val="20"/>
+        </w:rPr>
+        <w:t xml:space="preserve"> appends all rows into a unified table while injecting a _SheetName column to track row-level source provenance.</w:t>
+      </w:r>
+    </w:p>
+    <w:p>
+      <w:pPr>
+        <w:pStyle w:val="ListBullet"/>
+        <w:spacing w:before="20" w:after="40" w:line="276" w:lineRule="auto"/>
+      </w:pPr>
+      <w:r>
+        <w:rPr>
+          <w:rFonts w:ascii="Calibri" w:hAnsi="Calibri"/>
+          <w:color w:val="1E293B"/>
+          <w:sz w:val="20"/>
+        </w:rPr>
+      </w:r>
+      <w:r>
+        <w:rPr>
+          <w:rFonts w:ascii="Calibri" w:hAnsi="Calibri"/>
+          <w:b/>
+          <w:color w:val="1E293B"/>
+          <w:sz w:val="20"/>
+        </w:rPr>
+        <w:t>Relational Data Modeling Integration</w:t>
+      </w:r>
+      <w:r>
+        <w:rPr>
+          <w:rFonts w:ascii="Calibri" w:hAnsi="Calibri"/>
+          <w:color w:val="1E293B"/>
+          <w:sz w:val="20"/>
+        </w:rPr>
+        <w:t xml:space="preserve">: Secondary worksheets can be ingested directly into the </w:t>
+      </w:r>
+      <w:r>
+        <w:rPr>
+          <w:rFonts w:ascii="Calibri" w:hAnsi="Calibri"/>
+          <w:b/>
+          <w:color w:val="1E293B"/>
+          <w:sz w:val="20"/>
+        </w:rPr>
+        <w:t>Data Modeling Studio</w:t>
+      </w:r>
+      <w:r>
+        <w:rPr>
+          <w:rFonts w:ascii="Calibri" w:hAnsi="Calibri"/>
+          <w:color w:val="1E293B"/>
+          <w:sz w:val="20"/>
+        </w:rPr>
+        <w:t xml:space="preserve"> to perform in-memory Left, Inner, Right, and Full Outer Joins.</w:t>
+      </w:r>
+    </w:p>
+    <w:p>
+      <w:pPr>
+        <w:keepNext/>
+        <w:spacing w:before="280" w:after="80"/>
+      </w:pPr>
+      <w:r>
+        <w:rPr>
+          <w:rFonts w:ascii="Calibri" w:hAnsi="Calibri"/>
+          <w:b/>
+          <w:color w:val="1E293B"/>
+          <w:sz w:val="25"/>
+        </w:rPr>
+        <w:t>2.3 Resilient Clean Data Engine: Handling Macros, Formats &amp; Header Offsets</w:t>
+      </w:r>
+    </w:p>
+    <w:p>
+      <w:pPr>
+        <w:spacing w:before="40" w:after="120" w:line="288" w:lineRule="auto"/>
+      </w:pPr>
+      <w:r>
+        <w:rPr>
+          <w:rFonts w:ascii="Calibri" w:hAnsi="Calibri"/>
+          <w:color w:val="334155"/>
+          <w:sz w:val="20"/>
+        </w:rPr>
+        <w:t>Real-world enterprise spreadsheets frequently suffer from formatting anomalies, macros, and decorative banners that crash standard parsers. OmniDash incorporates a specialized resilient data cleaning pipeline:</w:t>
+      </w:r>
+    </w:p>
+    <w:tbl>
+      <w:tblPr>
+        <w:tblW w:type="auto" w:w="0"/>
+        <w:jc w:val="center"/>
+        <w:tblLook w:firstColumn="1" w:firstRow="1" w:lastColumn="0" w:lastRow="0" w:noHBand="0" w:noVBand="1" w:val="04A0"/>
+      </w:tblPr>
+      <w:tblGrid>
+        <w:gridCol w:w="9360"/>
+      </w:tblGrid>
+      <w:tr>
+        <w:tc>
+          <w:tcPr>
+            <w:tcW w:type="dxa" w:w="9936"/>
+            <w:shd w:fill="0F172A"/>
+            <w:tcMar>
+              <w:top w:w="100" w:type="dxa"/>
+              <w:bottom w:w="100" w:type="dxa"/>
+              <w:left w:w="140" w:type="dxa"/>
+              <w:right w:w="140" w:type="dxa"/>
+            </w:tcMar>
+          </w:tcPr>
+          <w:p>
+            <w:r>
+              <w:rPr>
+                <w:rFonts w:ascii="Consolas" w:hAnsi="Consolas"/>
+                <w:color w:val="E2E8F0"/>
+                <w:sz w:val="17"/>
+              </w:rPr>
+              <w:t>graph TD</w:t>
+              <w:br/>
+              <w:t xml:space="preserve">    A[Raw Excel / CSV / PDF Buffer] --&gt; B[Safe Reader: Bypasses VBA Macro Streams]</w:t>
+              <w:br/>
+              <w:t xml:space="preserve">    B --&gt; C[Merged Cell Propagation: Unmerges Spanned Header Cells]</w:t>
+              <w:br/>
+              <w:t xml:space="preserve">    C --&gt; D[Smart Banner Detector: Scans Top 15 Rows to Bypass Company Titles]</w:t>
+              <w:br/>
+              <w:t xml:space="preserve">    D --&gt; E[Summary Footer Isolator: Excludes 'Total' Rows to Prevent Double-Counting]</w:t>
+              <w:br/>
+              <w:t xml:space="preserve">    E --&gt; F[Value Sanitizer: Converts (1,200) to -1200, Sanitizes #REF! to null]</w:t>
+              <w:br/>
+              <w:t xml:space="preserve">    F --&gt; G[Statistical Profiling: Measure vs Date vs Dimension Inference]</w:t>
+            </w:r>
+          </w:p>
+        </w:tc>
+      </w:tr>
+    </w:tbl>
+    <w:p>
+      <w:pPr>
+        <w:spacing w:before="40" w:after="120"/>
+      </w:pPr>
+    </w:p>
+    <w:p>
+      <w:pPr>
+        <w:pStyle w:val="ListNumber"/>
+        <w:spacing w:before="20" w:after="40" w:line="276" w:lineRule="auto"/>
+      </w:pPr>
+      <w:r>
+        <w:rPr>
+          <w:rFonts w:ascii="Calibri" w:hAnsi="Calibri"/>
+          <w:color w:val="1E293B"/>
+          <w:sz w:val="20"/>
+        </w:rPr>
+      </w:r>
+      <w:r>
+        <w:rPr>
+          <w:rFonts w:ascii="Calibri" w:hAnsi="Calibri"/>
+          <w:b/>
+          <w:color w:val="1E293B"/>
+          <w:sz w:val="20"/>
+        </w:rPr>
+        <w:t>VBA Macro Bypassing (`.xlsm` / `.xlsb`)</w:t>
+      </w:r>
+      <w:r>
+        <w:rPr>
+          <w:rFonts w:ascii="Calibri" w:hAnsi="Calibri"/>
+          <w:color w:val="1E293B"/>
+          <w:sz w:val="20"/>
+        </w:rPr>
+        <w:t>:</w:t>
+      </w:r>
+    </w:p>
+    <w:p>
+      <w:pPr>
+        <w:pStyle w:val="ListBullet"/>
+        <w:spacing w:before="20" w:after="40" w:line="276" w:lineRule="auto"/>
+      </w:pPr>
+      <w:r>
+        <w:rPr>
+          <w:rFonts w:ascii="Calibri" w:hAnsi="Calibri"/>
+          <w:color w:val="1E293B"/>
+          <w:sz w:val="20"/>
+        </w:rPr>
+        <w:t>Macro-enabled workbooks often trigger security warnings or parser failures. OmniDash's engine safely extracts cell data tables while completely ignoring the VBA bytecode stream (vbaProject.bin).</w:t>
+      </w:r>
+    </w:p>
+    <w:p>
+      <w:pPr>
+        <w:pStyle w:val="ListNumber"/>
+        <w:spacing w:before="20" w:after="40" w:line="276" w:lineRule="auto"/>
+      </w:pPr>
+      <w:r>
+        <w:rPr>
+          <w:rFonts w:ascii="Calibri" w:hAnsi="Calibri"/>
+          <w:color w:val="1E293B"/>
+          <w:sz w:val="20"/>
+        </w:rPr>
+      </w:r>
+      <w:r>
+        <w:rPr>
+          <w:rFonts w:ascii="Calibri" w:hAnsi="Calibri"/>
+          <w:b/>
+          <w:color w:val="1E293B"/>
+          <w:sz w:val="20"/>
+        </w:rPr>
+        <w:t>Smart Banner Header Detection</w:t>
+      </w:r>
+      <w:r>
+        <w:rPr>
+          <w:rFonts w:ascii="Calibri" w:hAnsi="Calibri"/>
+          <w:color w:val="1E293B"/>
+          <w:sz w:val="20"/>
+        </w:rPr>
+        <w:t>:</w:t>
+      </w:r>
+    </w:p>
+    <w:p>
+      <w:pPr>
+        <w:pStyle w:val="ListBullet"/>
+        <w:spacing w:before="20" w:after="40" w:line="276" w:lineRule="auto"/>
+      </w:pPr>
+      <w:r>
+        <w:rPr>
+          <w:rFonts w:ascii="Calibri" w:hAnsi="Calibri"/>
+          <w:color w:val="1E293B"/>
+          <w:sz w:val="20"/>
+        </w:rPr>
+        <w:t>Business spreadsheets frequently place company logos, title banners, or confidentiality notices across rows 1–3 (e.g., *"ACME Corp Financial Report"*), pushing the true column headers to row 4 or 5.</w:t>
+      </w:r>
+    </w:p>
+    <w:p>
+      <w:pPr>
+        <w:pStyle w:val="ListBullet"/>
+        <w:spacing w:before="20" w:after="40" w:line="276" w:lineRule="auto"/>
+      </w:pPr>
+      <w:r>
+        <w:rPr>
+          <w:rFonts w:ascii="Calibri" w:hAnsi="Calibri"/>
+          <w:color w:val="1E293B"/>
+          <w:sz w:val="20"/>
+        </w:rPr>
+        <w:t>The engine scans the first 15 rows using a scoring heuristic (evaluating string density, column distinctness, and subsequent row alignment) to automatically align the true header row and bypass decorative titles.</w:t>
+      </w:r>
+    </w:p>
+    <w:p>
+      <w:pPr>
+        <w:pStyle w:val="ListNumber"/>
+        <w:spacing w:before="20" w:after="40" w:line="276" w:lineRule="auto"/>
+      </w:pPr>
+      <w:r>
+        <w:rPr>
+          <w:rFonts w:ascii="Calibri" w:hAnsi="Calibri"/>
+          <w:color w:val="1E293B"/>
+          <w:sz w:val="20"/>
+        </w:rPr>
+      </w:r>
+      <w:r>
+        <w:rPr>
+          <w:rFonts w:ascii="Calibri" w:hAnsi="Calibri"/>
+          <w:b/>
+          <w:color w:val="1E293B"/>
+          <w:sz w:val="20"/>
+        </w:rPr>
+        <w:t>Accounting Negatives Normalization</w:t>
+      </w:r>
+      <w:r>
+        <w:rPr>
+          <w:rFonts w:ascii="Calibri" w:hAnsi="Calibri"/>
+          <w:color w:val="1E293B"/>
+          <w:sz w:val="20"/>
+        </w:rPr>
+        <w:t>:</w:t>
+      </w:r>
+    </w:p>
+    <w:p>
+      <w:pPr>
+        <w:pStyle w:val="ListBullet"/>
+        <w:spacing w:before="20" w:after="40" w:line="276" w:lineRule="auto"/>
+      </w:pPr>
+      <w:r>
+        <w:rPr>
+          <w:rFonts w:ascii="Calibri" w:hAnsi="Calibri"/>
+          <w:color w:val="1E293B"/>
+          <w:sz w:val="20"/>
+        </w:rPr>
+        <w:t>Financial P&amp;L statements format negative values in parentheses (e.g., (1,234.56) or ($5,000.00)), which JavaScript native parsing converts to NaN.</w:t>
+      </w:r>
+    </w:p>
+    <w:p>
+      <w:pPr>
+        <w:pStyle w:val="ListBullet"/>
+        <w:spacing w:before="20" w:after="40" w:line="276" w:lineRule="auto"/>
+      </w:pPr>
+      <w:r>
+        <w:rPr>
+          <w:rFonts w:ascii="Calibri" w:hAnsi="Calibri"/>
+          <w:color w:val="1E293B"/>
+          <w:sz w:val="20"/>
+        </w:rPr>
+        <w:t>OmniDash automatically parses accounting parentheses and converts them into true floating-point negatives (-1234.56, -5000.00).</w:t>
+      </w:r>
+    </w:p>
+    <w:p>
+      <w:pPr>
+        <w:pStyle w:val="ListNumber"/>
+        <w:spacing w:before="20" w:after="40" w:line="276" w:lineRule="auto"/>
+      </w:pPr>
+      <w:r>
+        <w:rPr>
+          <w:rFonts w:ascii="Calibri" w:hAnsi="Calibri"/>
+          <w:color w:val="1E293B"/>
+          <w:sz w:val="20"/>
+        </w:rPr>
+      </w:r>
+      <w:r>
+        <w:rPr>
+          <w:rFonts w:ascii="Calibri" w:hAnsi="Calibri"/>
+          <w:b/>
+          <w:color w:val="1E293B"/>
+          <w:sz w:val="20"/>
+        </w:rPr>
+        <w:t>Currency &amp; Special Character Stripping</w:t>
+      </w:r>
+      <w:r>
+        <w:rPr>
+          <w:rFonts w:ascii="Calibri" w:hAnsi="Calibri"/>
+          <w:color w:val="1E293B"/>
+          <w:sz w:val="20"/>
+        </w:rPr>
+        <w:t>:</w:t>
+      </w:r>
+    </w:p>
+    <w:p>
+      <w:pPr>
+        <w:pStyle w:val="ListBullet"/>
+        <w:spacing w:before="20" w:after="40" w:line="276" w:lineRule="auto"/>
+      </w:pPr>
+      <w:r>
+        <w:rPr>
+          <w:rFonts w:ascii="Calibri" w:hAnsi="Calibri"/>
+          <w:color w:val="1E293B"/>
+          <w:sz w:val="20"/>
+        </w:rPr>
+        <w:t>International currency symbols ($, €, £, ¥, ₹, ₽, ₩, CHF), percentage signs (%), thousands commas, and invisible unicode whitespace (\u00A0, \u200B) are sanitized automatically.</w:t>
+      </w:r>
+    </w:p>
+    <w:p>
+      <w:pPr>
+        <w:pStyle w:val="ListNumber"/>
+        <w:spacing w:before="20" w:after="40" w:line="276" w:lineRule="auto"/>
+      </w:pPr>
+      <w:r>
+        <w:rPr>
+          <w:rFonts w:ascii="Calibri" w:hAnsi="Calibri"/>
+          <w:color w:val="1E293B"/>
+          <w:sz w:val="20"/>
+        </w:rPr>
+      </w:r>
+      <w:r>
+        <w:rPr>
+          <w:rFonts w:ascii="Calibri" w:hAnsi="Calibri"/>
+          <w:b/>
+          <w:color w:val="1E293B"/>
+          <w:sz w:val="20"/>
+        </w:rPr>
+        <w:t>Excel Formula Error Sanitization</w:t>
+      </w:r>
+      <w:r>
+        <w:rPr>
+          <w:rFonts w:ascii="Calibri" w:hAnsi="Calibri"/>
+          <w:color w:val="1E293B"/>
+          <w:sz w:val="20"/>
+        </w:rPr>
+        <w:t>:</w:t>
+      </w:r>
+    </w:p>
+    <w:p>
+      <w:pPr>
+        <w:pStyle w:val="ListBullet"/>
+        <w:spacing w:before="20" w:after="40" w:line="276" w:lineRule="auto"/>
+      </w:pPr>
+      <w:r>
+        <w:rPr>
+          <w:rFonts w:ascii="Calibri" w:hAnsi="Calibri"/>
+          <w:color w:val="1E293B"/>
+          <w:sz w:val="20"/>
+        </w:rPr>
+        <w:t>Broken formulas resulting in #REF!, #DIV/0!, #N/A, #VALUE!, #NAME?, #NUM!, or #NULL! are converted cleanly to null so downstream charts, KPIs, and calculated formulas do not fail.</w:t>
+      </w:r>
+    </w:p>
+    <w:p>
+      <w:pPr>
+        <w:pStyle w:val="ListNumber"/>
+        <w:spacing w:before="20" w:after="40" w:line="276" w:lineRule="auto"/>
+      </w:pPr>
+      <w:r>
+        <w:rPr>
+          <w:rFonts w:ascii="Calibri" w:hAnsi="Calibri"/>
+          <w:color w:val="1E293B"/>
+          <w:sz w:val="20"/>
+        </w:rPr>
+      </w:r>
+      <w:r>
+        <w:rPr>
+          <w:rFonts w:ascii="Calibri" w:hAnsi="Calibri"/>
+          <w:b/>
+          <w:color w:val="1E293B"/>
+          <w:sz w:val="20"/>
+        </w:rPr>
+        <w:t>Summary / Grand Total Footer Isolation</w:t>
+      </w:r>
+      <w:r>
+        <w:rPr>
+          <w:rFonts w:ascii="Calibri" w:hAnsi="Calibri"/>
+          <w:color w:val="1E293B"/>
+          <w:sz w:val="20"/>
+        </w:rPr>
+        <w:t>:</w:t>
+      </w:r>
+    </w:p>
+    <w:p>
+      <w:pPr>
+        <w:pStyle w:val="ListBullet"/>
+        <w:spacing w:before="20" w:after="40" w:line="276" w:lineRule="auto"/>
+      </w:pPr>
+      <w:r>
+        <w:rPr>
+          <w:rFonts w:ascii="Calibri" w:hAnsi="Calibri"/>
+          <w:color w:val="1E293B"/>
+          <w:sz w:val="20"/>
+        </w:rPr>
+        <w:t>Tables frequently conclude with a summary row (e.g. Total, Grand Total, or Average). Leaving these rows in the dataset inflates aggregations by 2x.</w:t>
+      </w:r>
+    </w:p>
+    <w:p>
+      <w:pPr>
+        <w:pStyle w:val="ListBullet"/>
+        <w:spacing w:before="20" w:after="40" w:line="276" w:lineRule="auto"/>
+      </w:pPr>
+      <w:r>
+        <w:rPr>
+          <w:rFonts w:ascii="Calibri" w:hAnsi="Calibri"/>
+          <w:color w:val="1E293B"/>
+          <w:sz w:val="20"/>
+        </w:rPr>
+        <w:t>OmniDash identifies footer summary rows, logs them in the cleaning audit, and isolates them from the analytical dataset to guarantee exact mathematical accuracy.</w:t>
+      </w:r>
+    </w:p>
+    <w:p>
+      <w:pPr>
+        <w:pStyle w:val="ListNumber"/>
+        <w:spacing w:before="20" w:after="40" w:line="276" w:lineRule="auto"/>
+      </w:pPr>
+      <w:r>
+        <w:rPr>
+          <w:rFonts w:ascii="Calibri" w:hAnsi="Calibri"/>
+          <w:color w:val="1E293B"/>
+          <w:sz w:val="20"/>
+        </w:rPr>
+      </w:r>
+      <w:r>
+        <w:rPr>
+          <w:rFonts w:ascii="Calibri" w:hAnsi="Calibri"/>
+          <w:b/>
+          <w:color w:val="1E293B"/>
+          <w:sz w:val="20"/>
+        </w:rPr>
+        <w:t>Merged Header Cell Propagation</w:t>
+      </w:r>
+      <w:r>
+        <w:rPr>
+          <w:rFonts w:ascii="Calibri" w:hAnsi="Calibri"/>
+          <w:color w:val="1E293B"/>
+          <w:sz w:val="20"/>
+        </w:rPr>
+        <w:t>:</w:t>
+      </w:r>
+    </w:p>
+    <w:p>
+      <w:pPr>
+        <w:pStyle w:val="ListBullet"/>
+        <w:spacing w:before="20" w:after="40" w:line="276" w:lineRule="auto"/>
+      </w:pPr>
+      <w:r>
+        <w:rPr>
+          <w:rFonts w:ascii="Calibri" w:hAnsi="Calibri"/>
+          <w:color w:val="1E293B"/>
+          <w:sz w:val="20"/>
+        </w:rPr>
+        <w:t>Merged header cells (such as "Q1 Actuals" merged across 3 sub-columns) are automatically unmerged and replicated across child column ranges.</w:t>
+      </w:r>
+    </w:p>
+    <w:p>
+      <w:pPr>
+        <w:keepNext/>
+        <w:spacing w:before="280" w:after="80"/>
+      </w:pPr>
+      <w:r>
+        <w:rPr>
+          <w:rFonts w:ascii="Calibri" w:hAnsi="Calibri"/>
+          <w:b/>
+          <w:color w:val="1E293B"/>
+          <w:sz w:val="25"/>
+        </w:rPr>
+        <w:t>2.4 Built-In Sample Datasets</w:t>
       </w:r>
     </w:p>
     <w:p>
@@ -1095,239 +1783,6 @@
           <w:sz w:val="17"/>
         </w:rPr>
         <w:t>Data Profiler</w:t>
-      </w:r>
-    </w:p>
-    <w:p>
-      <w:pPr>
-        <w:keepNext/>
-        <w:spacing w:before="280" w:after="80"/>
-      </w:pPr>
-      <w:r>
-        <w:rPr>
-          <w:rFonts w:ascii="Calibri" w:hAnsi="Calibri"/>
-          <w:b/>
-          <w:color w:val="1E293B"/>
-          <w:sz w:val="25"/>
-        </w:rPr>
-        <w:t>2.3 Behind the Scenes: Automated Profiling &amp; Data Cleaning Pipeline</w:t>
-      </w:r>
-    </w:p>
-    <w:p>
-      <w:pPr>
-        <w:spacing w:before="40" w:after="120" w:line="288" w:lineRule="auto"/>
-      </w:pPr>
-      <w:r>
-        <w:rPr>
-          <w:rFonts w:ascii="Calibri" w:hAnsi="Calibri"/>
-          <w:color w:val="334155"/>
-          <w:sz w:val="20"/>
-        </w:rPr>
-        <w:t>When a file is dropped into OmniDash, cleanAndProfileDataset executes a multi-pass heuristic pipeline:</w:t>
-      </w:r>
-    </w:p>
-    <w:tbl>
-      <w:tblPr>
-        <w:tblW w:type="auto" w:w="0"/>
-        <w:jc w:val="center"/>
-        <w:tblLook w:firstColumn="1" w:firstRow="1" w:lastColumn="0" w:lastRow="0" w:noHBand="0" w:noVBand="1" w:val="04A0"/>
-      </w:tblPr>
-      <w:tblGrid>
-        <w:gridCol w:w="9360"/>
-      </w:tblGrid>
-      <w:tr>
-        <w:tc>
-          <w:tcPr>
-            <w:tcW w:type="dxa" w:w="9936"/>
-            <w:shd w:fill="0F172A"/>
-            <w:tcMar>
-              <w:top w:w="100" w:type="dxa"/>
-              <w:bottom w:w="100" w:type="dxa"/>
-              <w:left w:w="140" w:type="dxa"/>
-              <w:right w:w="140" w:type="dxa"/>
-            </w:tcMar>
-          </w:tcPr>
-          <w:p>
-            <w:r>
-              <w:rPr>
-                <w:rFonts w:ascii="Consolas" w:hAnsi="Consolas"/>
-                <w:color w:val="E2E8F0"/>
-                <w:sz w:val="17"/>
-              </w:rPr>
-              <w:t>graph TD</w:t>
-              <w:br/>
-              <w:t xml:space="preserve">    A[Raw File / Buffer] --&gt; B[Universal Parser: PapaParse / SheetJS / PDF.js]</w:t>
-              <w:br/>
-              <w:t xml:space="preserve">    B --&gt; C[Column Normalization &amp; Header Clean]</w:t>
-              <w:br/>
-              <w:t xml:space="preserve">    C --&gt; D[Type Inference: Numeric vs Date vs Categorical]</w:t>
-              <w:br/>
-              <w:t xml:space="preserve">    D --&gt; E[Currency &amp; Accounting Sanitizer: Remove $, €, commas, (1200) -&gt; -1200]</w:t>
-              <w:br/>
-              <w:t xml:space="preserve">    E --&gt; F[Statistical Profiling: Cardinality, Min/Max, Mean, Missing %]</w:t>
-              <w:br/>
-              <w:t xml:space="preserve">    F --&gt; G[Smart Suggestion Engine: Primary Date Col &amp; Recommended Metrics]</w:t>
-            </w:r>
-          </w:p>
-        </w:tc>
-      </w:tr>
-    </w:tbl>
-    <w:p>
-      <w:pPr>
-        <w:spacing w:before="40" w:after="120"/>
-      </w:pPr>
-    </w:p>
-    <w:p>
-      <w:pPr>
-        <w:pStyle w:val="ListNumber"/>
-        <w:spacing w:before="20" w:after="40" w:line="276" w:lineRule="auto"/>
-      </w:pPr>
-      <w:r>
-        <w:rPr>
-          <w:rFonts w:ascii="Calibri" w:hAnsi="Calibri"/>
-          <w:color w:val="1E293B"/>
-          <w:sz w:val="20"/>
-        </w:rPr>
-      </w:r>
-      <w:r>
-        <w:rPr>
-          <w:rFonts w:ascii="Calibri" w:hAnsi="Calibri"/>
-          <w:b/>
-          <w:color w:val="1E293B"/>
-          <w:sz w:val="20"/>
-        </w:rPr>
-        <w:t>Header Sanitization</w:t>
-      </w:r>
-      <w:r>
-        <w:rPr>
-          <w:rFonts w:ascii="Calibri" w:hAnsi="Calibri"/>
-          <w:color w:val="1E293B"/>
-          <w:sz w:val="20"/>
-        </w:rPr>
-        <w:t>: Trims whitespace, cleans control characters, and deduplicates identical header names.</w:t>
-      </w:r>
-    </w:p>
-    <w:p>
-      <w:pPr>
-        <w:pStyle w:val="ListNumber"/>
-        <w:spacing w:before="20" w:after="40" w:line="276" w:lineRule="auto"/>
-      </w:pPr>
-      <w:r>
-        <w:rPr>
-          <w:rFonts w:ascii="Calibri" w:hAnsi="Calibri"/>
-          <w:color w:val="1E293B"/>
-          <w:sz w:val="20"/>
-        </w:rPr>
-      </w:r>
-      <w:r>
-        <w:rPr>
-          <w:rFonts w:ascii="Calibri" w:hAnsi="Calibri"/>
-          <w:b/>
-          <w:color w:val="1E293B"/>
-          <w:sz w:val="20"/>
-        </w:rPr>
-        <w:t>Numeric Sanitization</w:t>
-      </w:r>
-      <w:r>
-        <w:rPr>
-          <w:rFonts w:ascii="Calibri" w:hAnsi="Calibri"/>
-          <w:color w:val="1E293B"/>
-          <w:sz w:val="20"/>
-        </w:rPr>
-        <w:t>: Automatically strips currency signs ($, €, £, ¥), percentage symbols (%), and thousand separators (,). Parses accounting negatives formatted in parentheses (e.g., (2,450.00) is correctly parsed into -2450).</w:t>
-      </w:r>
-    </w:p>
-    <w:p>
-      <w:pPr>
-        <w:pStyle w:val="ListNumber"/>
-        <w:spacing w:before="20" w:after="40" w:line="276" w:lineRule="auto"/>
-      </w:pPr>
-      <w:r>
-        <w:rPr>
-          <w:rFonts w:ascii="Calibri" w:hAnsi="Calibri"/>
-          <w:color w:val="1E293B"/>
-          <w:sz w:val="20"/>
-        </w:rPr>
-      </w:r>
-      <w:r>
-        <w:rPr>
-          <w:rFonts w:ascii="Calibri" w:hAnsi="Calibri"/>
-          <w:b/>
-          <w:color w:val="1E293B"/>
-          <w:sz w:val="20"/>
-        </w:rPr>
-        <w:t>Date Detection</w:t>
-      </w:r>
-      <w:r>
-        <w:rPr>
-          <w:rFonts w:ascii="Calibri" w:hAnsi="Calibri"/>
-          <w:color w:val="1E293B"/>
-          <w:sz w:val="20"/>
-        </w:rPr>
-        <w:t>: Evaluates temporal patterns (ISO 8601, YYYY-MM-DD, MM/DD/YYYY, DD-MMM-YYYY) and assigns the primary chronological axis for time-series charts.</w:t>
-      </w:r>
-    </w:p>
-    <w:p>
-      <w:pPr>
-        <w:pStyle w:val="ListNumber"/>
-        <w:spacing w:before="20" w:after="40" w:line="276" w:lineRule="auto"/>
-      </w:pPr>
-      <w:r>
-        <w:rPr>
-          <w:rFonts w:ascii="Calibri" w:hAnsi="Calibri"/>
-          <w:color w:val="1E293B"/>
-          <w:sz w:val="20"/>
-        </w:rPr>
-      </w:r>
-      <w:r>
-        <w:rPr>
-          <w:rFonts w:ascii="Calibri" w:hAnsi="Calibri"/>
-          <w:b/>
-          <w:color w:val="1E293B"/>
-          <w:sz w:val="20"/>
-        </w:rPr>
-        <w:t>Cardinality &amp; Distribution</w:t>
-      </w:r>
-      <w:r>
-        <w:rPr>
-          <w:rFonts w:ascii="Calibri" w:hAnsi="Calibri"/>
-          <w:color w:val="1E293B"/>
-          <w:sz w:val="20"/>
-        </w:rPr>
-        <w:t xml:space="preserve">: Calculates null counts, unique distinct values, min, max, average, and recommends whether a column should serve as an analytical </w:t>
-      </w:r>
-      <w:r>
-        <w:rPr>
-          <w:rFonts w:ascii="Calibri" w:hAnsi="Calibri"/>
-          <w:b/>
-          <w:color w:val="1E293B"/>
-          <w:sz w:val="20"/>
-        </w:rPr>
-        <w:t>Dimension</w:t>
-      </w:r>
-      <w:r>
-        <w:rPr>
-          <w:rFonts w:ascii="Calibri" w:hAnsi="Calibri"/>
-          <w:color w:val="1E293B"/>
-          <w:sz w:val="20"/>
-        </w:rPr>
-        <w:t xml:space="preserve"> (categorical bucket) or a </w:t>
-      </w:r>
-      <w:r>
-        <w:rPr>
-          <w:rFonts w:ascii="Calibri" w:hAnsi="Calibri"/>
-          <w:b/>
-          <w:color w:val="1E293B"/>
-          <w:sz w:val="20"/>
-        </w:rPr>
-        <w:t>Measure</w:t>
-      </w:r>
-      <w:r>
-        <w:rPr>
-          <w:rFonts w:ascii="Calibri" w:hAnsi="Calibri"/>
-          <w:color w:val="1E293B"/>
-          <w:sz w:val="20"/>
-        </w:rPr>
-        <w:t xml:space="preserve"> (aggregatable metric).</w:t>
       </w:r>
     </w:p>
     <w:p>
@@ -4298,6 +4753,186 @@
     <w:p>
       <w:pPr>
         <w:keepNext/>
+        <w:spacing w:before="280" w:after="80"/>
+      </w:pPr>
+      <w:r>
+        <w:rPr>
+          <w:rFonts w:ascii="Calibri" w:hAnsi="Calibri"/>
+          <w:b/>
+          <w:color w:val="1E293B"/>
+          <w:sz w:val="25"/>
+        </w:rPr>
+        <w:t>5.3 Executive Ergonomics &amp; High-Contrast Visual Design</w:t>
+      </w:r>
+    </w:p>
+    <w:p>
+      <w:pPr>
+        <w:pStyle w:val="ListBullet"/>
+        <w:spacing w:before="20" w:after="40" w:line="276" w:lineRule="auto"/>
+      </w:pPr>
+      <w:r>
+        <w:rPr>
+          <w:rFonts w:ascii="Calibri" w:hAnsi="Calibri"/>
+          <w:color w:val="1E293B"/>
+          <w:sz w:val="20"/>
+        </w:rPr>
+      </w:r>
+      <w:r>
+        <w:rPr>
+          <w:rFonts w:ascii="Calibri" w:hAnsi="Calibri"/>
+          <w:b/>
+          <w:color w:val="1E293B"/>
+          <w:sz w:val="20"/>
+        </w:rPr>
+        <w:t>High-Contrast Black Typography (Light Theme)</w:t>
+      </w:r>
+      <w:r>
+        <w:rPr>
+          <w:rFonts w:ascii="Calibri" w:hAnsi="Calibri"/>
+          <w:color w:val="1E293B"/>
+          <w:sz w:val="20"/>
+        </w:rPr>
+        <w:t>:</w:t>
+      </w:r>
+    </w:p>
+    <w:p>
+      <w:pPr>
+        <w:pStyle w:val="ListBullet"/>
+        <w:spacing w:before="20" w:after="40" w:line="276" w:lineRule="auto"/>
+      </w:pPr>
+      <w:r>
+        <w:rPr>
+          <w:rFonts w:ascii="Calibri" w:hAnsi="Calibri"/>
+          <w:color w:val="1E293B"/>
+          <w:sz w:val="20"/>
+        </w:rPr>
+        <w:t>Designed for high-glare environments, executive projectors, and printed handouts, the Light Theme applies pure solid black (#000000 !important) typography across all headers (h1–h6), descriptive sub-headers, KPI titles, modal labels, and table column headers. This eliminates low-contrast grey text and ensures crisp optical legibility.</w:t>
+      </w:r>
+    </w:p>
+    <w:p>
+      <w:pPr>
+        <w:pStyle w:val="ListBullet"/>
+        <w:spacing w:before="20" w:after="40" w:line="276" w:lineRule="auto"/>
+      </w:pPr>
+      <w:r>
+        <w:rPr>
+          <w:rFonts w:ascii="Calibri" w:hAnsi="Calibri"/>
+          <w:color w:val="1E293B"/>
+          <w:sz w:val="20"/>
+        </w:rPr>
+      </w:r>
+      <w:r>
+        <w:rPr>
+          <w:rFonts w:ascii="Calibri" w:hAnsi="Calibri"/>
+          <w:b/>
+          <w:color w:val="1E293B"/>
+          <w:sz w:val="20"/>
+        </w:rPr>
+        <w:t>Unified Accordion Action Toolbar</w:t>
+      </w:r>
+      <w:r>
+        <w:rPr>
+          <w:rFonts w:ascii="Calibri" w:hAnsi="Calibri"/>
+          <w:color w:val="1E293B"/>
+          <w:sz w:val="20"/>
+        </w:rPr>
+        <w:t>:</w:t>
+      </w:r>
+    </w:p>
+    <w:p>
+      <w:pPr>
+        <w:pStyle w:val="ListBullet"/>
+        <w:spacing w:before="20" w:after="40" w:line="276" w:lineRule="auto"/>
+      </w:pPr>
+      <w:r>
+        <w:rPr>
+          <w:rFonts w:ascii="Calibri" w:hAnsi="Calibri"/>
+          <w:color w:val="1E293B"/>
+          <w:sz w:val="20"/>
+        </w:rPr>
+        <w:t>The primary navbar features expanding accordion action tabs (*Upload Data*, *Presentation Studio*, *Calculated Field*, *Data Profiler*, *Data Modeling*, *Smart Insights*, *AI Analyst*, *Drive Sync*, *Export*).</w:t>
+      </w:r>
+    </w:p>
+    <w:p>
+      <w:pPr>
+        <w:pStyle w:val="ListBullet"/>
+        <w:spacing w:before="20" w:after="40" w:line="276" w:lineRule="auto"/>
+      </w:pPr>
+      <w:r>
+        <w:rPr>
+          <w:rFonts w:ascii="Calibri" w:hAnsi="Calibri"/>
+          <w:color w:val="1E293B"/>
+          <w:sz w:val="20"/>
+        </w:rPr>
+      </w:r>
+      <w:r>
+        <w:rPr>
+          <w:rFonts w:ascii="Calibri" w:hAnsi="Calibri"/>
+          <w:b/>
+          <w:color w:val="1E293B"/>
+          <w:sz w:val="20"/>
+        </w:rPr>
+        <w:t>Collapsed State</w:t>
+      </w:r>
+      <w:r>
+        <w:rPr>
+          <w:rFonts w:ascii="Calibri" w:hAnsi="Calibri"/>
+          <w:color w:val="1E293B"/>
+          <w:sz w:val="20"/>
+        </w:rPr>
+        <w:t>: Renders in an understated, subtle brand blue tone (rgba(99, 102, 241, 0.12)) with a clean blue icon indicator.</w:t>
+      </w:r>
+    </w:p>
+    <w:p>
+      <w:pPr>
+        <w:pStyle w:val="ListBullet"/>
+        <w:spacing w:before="20" w:after="40" w:line="276" w:lineRule="auto"/>
+      </w:pPr>
+      <w:r>
+        <w:rPr>
+          <w:rFonts w:ascii="Calibri" w:hAnsi="Calibri"/>
+          <w:color w:val="1E293B"/>
+          <w:sz w:val="20"/>
+        </w:rPr>
+      </w:r>
+      <w:r>
+        <w:rPr>
+          <w:rFonts w:ascii="Calibri" w:hAnsi="Calibri"/>
+          <w:b/>
+          <w:color w:val="1E293B"/>
+          <w:sz w:val="20"/>
+        </w:rPr>
+        <w:t>Expanded &amp; Active State</w:t>
+      </w:r>
+      <w:r>
+        <w:rPr>
+          <w:rFonts w:ascii="Calibri" w:hAnsi="Calibri"/>
+          <w:color w:val="1E293B"/>
+          <w:sz w:val="20"/>
+        </w:rPr>
+        <w:t xml:space="preserve">: Across </w:t>
+      </w:r>
+      <w:r>
+        <w:rPr>
+          <w:rFonts w:ascii="Calibri" w:hAnsi="Calibri"/>
+          <w:b/>
+          <w:color w:val="1E293B"/>
+          <w:sz w:val="20"/>
+        </w:rPr>
+        <w:t>both Light and Dark themes</w:t>
+      </w:r>
+      <w:r>
+        <w:rPr>
+          <w:rFonts w:ascii="Calibri" w:hAnsi="Calibri"/>
+          <w:color w:val="1E293B"/>
+          <w:sz w:val="20"/>
+        </w:rPr>
+        <w:t>, hovering or expanding an action tab activates a uniform royal blue gradient (#6366f1 / #4f46e5) with solid white font (#ffffff) and white icons, matching the visual identity of the active *Dashboard Workspace* pill.</w:t>
+      </w:r>
+    </w:p>
+    <w:p>
+      <w:pPr>
+        <w:keepNext/>
         <w:spacing w:before="360" w:after="120"/>
       </w:pPr>
       <w:r>

</xml_diff>

<commit_message>
feat: add widget spotlight zoom lightbox with enlarged chart, metrics strip, and underlying data table
</commit_message>
<xml_diff>
--- a/OmniDash_Email_Package/OmniDash_Executive_User_Guide.docx
+++ b/OmniDash_Email_Package/OmniDash_Executive_User_Guide.docx
@@ -4928,6 +4928,575 @@
           <w:sz w:val="20"/>
         </w:rPr>
         <w:t>, hovering or expanding an action tab activates a uniform royal blue gradient (#6366f1 / #4f46e5) with solid white font (#ffffff) and white icons, matching the visual identity of the active *Dashboard Workspace* pill.</w:t>
+      </w:r>
+    </w:p>
+    <w:p>
+      <w:pPr>
+        <w:keepNext/>
+        <w:spacing w:before="280" w:after="80"/>
+      </w:pPr>
+      <w:r>
+        <w:rPr>
+          <w:rFonts w:ascii="Calibri" w:hAnsi="Calibri"/>
+          <w:b/>
+          <w:color w:val="1E293B"/>
+          <w:sz w:val="25"/>
+        </w:rPr>
+        <w:t>5.4 Widget Spotlight Zoom &amp; Underlying Data Table Inspection</w:t>
+      </w:r>
+    </w:p>
+    <w:p>
+      <w:pPr>
+        <w:spacing w:before="40" w:after="120" w:line="288" w:lineRule="auto"/>
+      </w:pPr>
+      <w:r>
+        <w:rPr>
+          <w:rFonts w:ascii="Calibri" w:hAnsi="Calibri"/>
+          <w:color w:val="334155"/>
+          <w:sz w:val="20"/>
+        </w:rPr>
+        <w:t xml:space="preserve">To facilitate granular inspection of complex multi-series trends, crowded categorical bars, or dense pivot tables, OmniDash provides an </w:t>
+      </w:r>
+      <w:r>
+        <w:rPr>
+          <w:rFonts w:ascii="Calibri" w:hAnsi="Calibri"/>
+          <w:b/>
+          <w:color w:val="334155"/>
+          <w:sz w:val="20"/>
+        </w:rPr>
+        <w:t>Executive Spotlight Zoom Lightbox</w:t>
+      </w:r>
+      <w:r>
+        <w:rPr>
+          <w:rFonts w:ascii="Calibri" w:hAnsi="Calibri"/>
+          <w:color w:val="334155"/>
+          <w:sz w:val="20"/>
+        </w:rPr>
+        <w:t>:</w:t>
+      </w:r>
+    </w:p>
+    <w:p>
+      <w:pPr>
+        <w:pStyle w:val="ListBullet"/>
+        <w:spacing w:before="20" w:after="40" w:line="276" w:lineRule="auto"/>
+      </w:pPr>
+      <w:r>
+        <w:rPr>
+          <w:rFonts w:ascii="Calibri" w:hAnsi="Calibri"/>
+          <w:color w:val="1E293B"/>
+          <w:sz w:val="20"/>
+        </w:rPr>
+      </w:r>
+      <w:r>
+        <w:rPr>
+          <w:rFonts w:ascii="Calibri" w:hAnsi="Calibri"/>
+          <w:b/>
+          <w:color w:val="1E293B"/>
+          <w:sz w:val="20"/>
+        </w:rPr>
+        <w:t>How to Trigger</w:t>
+      </w:r>
+      <w:r>
+        <w:rPr>
+          <w:rFonts w:ascii="Calibri" w:hAnsi="Calibri"/>
+          <w:color w:val="1E293B"/>
+          <w:sz w:val="20"/>
+        </w:rPr>
+        <w:t>:</w:t>
+      </w:r>
+    </w:p>
+    <w:p>
+      <w:pPr>
+        <w:pStyle w:val="ListBullet"/>
+        <w:spacing w:before="20" w:after="40" w:line="276" w:lineRule="auto"/>
+      </w:pPr>
+      <w:r>
+        <w:rPr>
+          <w:rFonts w:ascii="Calibri" w:hAnsi="Calibri"/>
+          <w:color w:val="1E293B"/>
+          <w:sz w:val="20"/>
+        </w:rPr>
+        <w:t xml:space="preserve">Click the </w:t>
+      </w:r>
+      <w:r>
+        <w:rPr>
+          <w:rFonts w:ascii="Calibri" w:hAnsi="Calibri"/>
+          <w:b/>
+          <w:color w:val="1E293B"/>
+          <w:sz w:val="20"/>
+        </w:rPr>
+        <w:t>Maximize / Zoom</w:t>
+      </w:r>
+      <w:r>
+        <w:rPr>
+          <w:rFonts w:ascii="Calibri" w:hAnsi="Calibri"/>
+          <w:color w:val="1E293B"/>
+          <w:sz w:val="20"/>
+        </w:rPr>
+        <w:t xml:space="preserve"> icon button in the top-right header of any reporting widget card.</w:t>
+      </w:r>
+    </w:p>
+    <w:p>
+      <w:pPr>
+        <w:pStyle w:val="ListBullet"/>
+        <w:spacing w:before="20" w:after="40" w:line="276" w:lineRule="auto"/>
+      </w:pPr>
+      <w:r>
+        <w:rPr>
+          <w:rFonts w:ascii="Calibri" w:hAnsi="Calibri"/>
+          <w:color w:val="1E293B"/>
+          <w:sz w:val="20"/>
+        </w:rPr>
+        <w:t xml:space="preserve">Alternatively, </w:t>
+      </w:r>
+      <w:r>
+        <w:rPr>
+          <w:rFonts w:ascii="Calibri" w:hAnsi="Calibri"/>
+          <w:b/>
+          <w:color w:val="1E293B"/>
+          <w:sz w:val="20"/>
+        </w:rPr>
+        <w:t>double-click</w:t>
+      </w:r>
+      <w:r>
+        <w:rPr>
+          <w:rFonts w:ascii="Calibri" w:hAnsi="Calibri"/>
+          <w:color w:val="1E293B"/>
+          <w:sz w:val="20"/>
+        </w:rPr>
+        <w:t xml:space="preserve"> anywhere on the widget card header.</w:t>
+      </w:r>
+    </w:p>
+    <w:p>
+      <w:pPr>
+        <w:pStyle w:val="ListBullet"/>
+        <w:spacing w:before="20" w:after="40" w:line="276" w:lineRule="auto"/>
+      </w:pPr>
+      <w:r>
+        <w:rPr>
+          <w:rFonts w:ascii="Calibri" w:hAnsi="Calibri"/>
+          <w:color w:val="1E293B"/>
+          <w:sz w:val="20"/>
+        </w:rPr>
+      </w:r>
+      <w:r>
+        <w:rPr>
+          <w:rFonts w:ascii="Calibri" w:hAnsi="Calibri"/>
+          <w:b/>
+          <w:color w:val="1E293B"/>
+          <w:sz w:val="20"/>
+        </w:rPr>
+        <w:t>Widescreen High-Resolution Canvas (94vw × 90vh)</w:t>
+      </w:r>
+      <w:r>
+        <w:rPr>
+          <w:rFonts w:ascii="Calibri" w:hAnsi="Calibri"/>
+          <w:color w:val="1E293B"/>
+          <w:sz w:val="20"/>
+        </w:rPr>
+        <w:t>:</w:t>
+      </w:r>
+    </w:p>
+    <w:p>
+      <w:pPr>
+        <w:pStyle w:val="ListBullet"/>
+        <w:spacing w:before="20" w:after="40" w:line="276" w:lineRule="auto"/>
+      </w:pPr>
+      <w:r>
+        <w:rPr>
+          <w:rFonts w:ascii="Calibri" w:hAnsi="Calibri"/>
+          <w:color w:val="1E293B"/>
+          <w:sz w:val="20"/>
+        </w:rPr>
+        <w:t>Dynamically re-renders the chart in large widescreen format, providing spacious axis labeling, expanded splines, and high-contrast tooltip fidelity.</w:t>
+      </w:r>
+    </w:p>
+    <w:p>
+      <w:pPr>
+        <w:pStyle w:val="ListBullet"/>
+        <w:spacing w:before="20" w:after="40" w:line="276" w:lineRule="auto"/>
+      </w:pPr>
+      <w:r>
+        <w:rPr>
+          <w:rFonts w:ascii="Calibri" w:hAnsi="Calibri"/>
+          <w:color w:val="1E293B"/>
+          <w:sz w:val="20"/>
+        </w:rPr>
+      </w:r>
+      <w:r>
+        <w:rPr>
+          <w:rFonts w:ascii="Calibri" w:hAnsi="Calibri"/>
+          <w:b/>
+          <w:color w:val="1E293B"/>
+          <w:sz w:val="20"/>
+        </w:rPr>
+        <w:t>Executive Summary Metrics Strip</w:t>
+      </w:r>
+      <w:r>
+        <w:rPr>
+          <w:rFonts w:ascii="Calibri" w:hAnsi="Calibri"/>
+          <w:color w:val="1E293B"/>
+          <w:sz w:val="20"/>
+        </w:rPr>
+        <w:t>:</w:t>
+      </w:r>
+    </w:p>
+    <w:p>
+      <w:pPr>
+        <w:pStyle w:val="ListBullet"/>
+        <w:spacing w:before="20" w:after="40" w:line="276" w:lineRule="auto"/>
+      </w:pPr>
+      <w:r>
+        <w:rPr>
+          <w:rFonts w:ascii="Calibri" w:hAnsi="Calibri"/>
+          <w:color w:val="1E293B"/>
+          <w:sz w:val="20"/>
+        </w:rPr>
+        <w:t>Prominently calculates five statistical velocity metrics for the active chart:</w:t>
+      </w:r>
+    </w:p>
+    <w:p>
+      <w:pPr>
+        <w:pStyle w:val="ListBullet"/>
+        <w:spacing w:before="20" w:after="40" w:line="276" w:lineRule="auto"/>
+      </w:pPr>
+      <w:r>
+        <w:rPr>
+          <w:rFonts w:ascii="Calibri" w:hAnsi="Calibri"/>
+          <w:color w:val="1E293B"/>
+          <w:sz w:val="20"/>
+        </w:rPr>
+      </w:r>
+      <w:r>
+        <w:rPr>
+          <w:rFonts w:ascii="Calibri" w:hAnsi="Calibri"/>
+          <w:b/>
+          <w:color w:val="1E293B"/>
+          <w:sz w:val="20"/>
+        </w:rPr>
+        <w:t>Series Total</w:t>
+      </w:r>
+      <w:r>
+        <w:rPr>
+          <w:rFonts w:ascii="Calibri" w:hAnsi="Calibri"/>
+          <w:color w:val="1E293B"/>
+          <w:sz w:val="20"/>
+        </w:rPr>
+        <w:t>: Formatted aggregate sum.</w:t>
+      </w:r>
+    </w:p>
+    <w:p>
+      <w:pPr>
+        <w:pStyle w:val="ListBullet"/>
+        <w:spacing w:before="20" w:after="40" w:line="276" w:lineRule="auto"/>
+      </w:pPr>
+      <w:r>
+        <w:rPr>
+          <w:rFonts w:ascii="Calibri" w:hAnsi="Calibri"/>
+          <w:color w:val="1E293B"/>
+          <w:sz w:val="20"/>
+        </w:rPr>
+      </w:r>
+      <w:r>
+        <w:rPr>
+          <w:rFonts w:ascii="Calibri" w:hAnsi="Calibri"/>
+          <w:b/>
+          <w:color w:val="1E293B"/>
+          <w:sz w:val="20"/>
+        </w:rPr>
+        <w:t>Category Average</w:t>
+      </w:r>
+      <w:r>
+        <w:rPr>
+          <w:rFonts w:ascii="Calibri" w:hAnsi="Calibri"/>
+          <w:color w:val="1E293B"/>
+          <w:sz w:val="20"/>
+        </w:rPr>
+        <w:t>: Mean value per category/bucket.</w:t>
+      </w:r>
+    </w:p>
+    <w:p>
+      <w:pPr>
+        <w:pStyle w:val="ListBullet"/>
+        <w:spacing w:before="20" w:after="40" w:line="276" w:lineRule="auto"/>
+      </w:pPr>
+      <w:r>
+        <w:rPr>
+          <w:rFonts w:ascii="Calibri" w:hAnsi="Calibri"/>
+          <w:color w:val="1E293B"/>
+          <w:sz w:val="20"/>
+        </w:rPr>
+      </w:r>
+      <w:r>
+        <w:rPr>
+          <w:rFonts w:ascii="Calibri" w:hAnsi="Calibri"/>
+          <w:b/>
+          <w:color w:val="1E293B"/>
+          <w:sz w:val="20"/>
+        </w:rPr>
+        <w:t>Peak Point</w:t>
+      </w:r>
+      <w:r>
+        <w:rPr>
+          <w:rFonts w:ascii="Calibri" w:hAnsi="Calibri"/>
+          <w:color w:val="1E293B"/>
+          <w:sz w:val="20"/>
+        </w:rPr>
+        <w:t>: Highest point value and its corresponding category label.</w:t>
+      </w:r>
+    </w:p>
+    <w:p>
+      <w:pPr>
+        <w:pStyle w:val="ListBullet"/>
+        <w:spacing w:before="20" w:after="40" w:line="276" w:lineRule="auto"/>
+      </w:pPr>
+      <w:r>
+        <w:rPr>
+          <w:rFonts w:ascii="Calibri" w:hAnsi="Calibri"/>
+          <w:color w:val="1E293B"/>
+          <w:sz w:val="20"/>
+        </w:rPr>
+      </w:r>
+      <w:r>
+        <w:rPr>
+          <w:rFonts w:ascii="Calibri" w:hAnsi="Calibri"/>
+          <w:b/>
+          <w:color w:val="1E293B"/>
+          <w:sz w:val="20"/>
+        </w:rPr>
+        <w:t>Trough Point</w:t>
+      </w:r>
+      <w:r>
+        <w:rPr>
+          <w:rFonts w:ascii="Calibri" w:hAnsi="Calibri"/>
+          <w:color w:val="1E293B"/>
+          <w:sz w:val="20"/>
+        </w:rPr>
+        <w:t>: Lowest point value and its corresponding category label.</w:t>
+      </w:r>
+    </w:p>
+    <w:p>
+      <w:pPr>
+        <w:pStyle w:val="ListBullet"/>
+        <w:spacing w:before="20" w:after="40" w:line="276" w:lineRule="auto"/>
+      </w:pPr>
+      <w:r>
+        <w:rPr>
+          <w:rFonts w:ascii="Calibri" w:hAnsi="Calibri"/>
+          <w:color w:val="1E293B"/>
+          <w:sz w:val="20"/>
+        </w:rPr>
+      </w:r>
+      <w:r>
+        <w:rPr>
+          <w:rFonts w:ascii="Calibri" w:hAnsi="Calibri"/>
+          <w:b/>
+          <w:color w:val="1E293B"/>
+          <w:sz w:val="20"/>
+        </w:rPr>
+        <w:t>Categories/Points Count</w:t>
+      </w:r>
+      <w:r>
+        <w:rPr>
+          <w:rFonts w:ascii="Calibri" w:hAnsi="Calibri"/>
+          <w:color w:val="1E293B"/>
+          <w:sz w:val="20"/>
+        </w:rPr>
+        <w:t>: Total distinct observation count.</w:t>
+      </w:r>
+    </w:p>
+    <w:p>
+      <w:pPr>
+        <w:pStyle w:val="ListBullet"/>
+        <w:spacing w:before="20" w:after="40" w:line="276" w:lineRule="auto"/>
+      </w:pPr>
+      <w:r>
+        <w:rPr>
+          <w:rFonts w:ascii="Calibri" w:hAnsi="Calibri"/>
+          <w:color w:val="1E293B"/>
+          <w:sz w:val="20"/>
+        </w:rPr>
+      </w:r>
+      <w:r>
+        <w:rPr>
+          <w:rFonts w:ascii="Calibri" w:hAnsi="Calibri"/>
+          <w:b/>
+          <w:color w:val="1E293B"/>
+          <w:sz w:val="20"/>
+        </w:rPr>
+        <w:t>Underlying Data Table Toggle</w:t>
+      </w:r>
+      <w:r>
+        <w:rPr>
+          <w:rFonts w:ascii="Calibri" w:hAnsi="Calibri"/>
+          <w:color w:val="1E293B"/>
+          <w:sz w:val="20"/>
+        </w:rPr>
+        <w:t>:</w:t>
+      </w:r>
+    </w:p>
+    <w:p>
+      <w:pPr>
+        <w:pStyle w:val="ListBullet"/>
+        <w:spacing w:before="20" w:after="40" w:line="276" w:lineRule="auto"/>
+      </w:pPr>
+      <w:r>
+        <w:rPr>
+          <w:rFonts w:ascii="Calibri" w:hAnsi="Calibri"/>
+          <w:color w:val="1E293B"/>
+          <w:sz w:val="20"/>
+        </w:rPr>
+        <w:t>Switch seamlessly between [ 📈 Chart View ] and [ 📋 Underlying Data Table ].</w:t>
+      </w:r>
+    </w:p>
+    <w:p>
+      <w:pPr>
+        <w:pStyle w:val="ListBullet"/>
+        <w:spacing w:before="20" w:after="40" w:line="276" w:lineRule="auto"/>
+      </w:pPr>
+      <w:r>
+        <w:rPr>
+          <w:rFonts w:ascii="Calibri" w:hAnsi="Calibri"/>
+          <w:color w:val="1E293B"/>
+          <w:sz w:val="20"/>
+        </w:rPr>
+        <w:t xml:space="preserve">The tabular view features live real-time search filtering, column sorting on click, category attribution, formatted values, and dynamic </w:t>
+      </w:r>
+      <w:r>
+        <w:rPr>
+          <w:rFonts w:ascii="Calibri" w:hAnsi="Calibri"/>
+          <w:b/>
+          <w:color w:val="1E293B"/>
+          <w:sz w:val="20"/>
+        </w:rPr>
+        <w:t>Share of Total %</w:t>
+      </w:r>
+      <w:r>
+        <w:rPr>
+          <w:rFonts w:ascii="Calibri" w:hAnsi="Calibri"/>
+          <w:color w:val="1E293B"/>
+          <w:sz w:val="20"/>
+        </w:rPr>
+        <w:t xml:space="preserve"> calculations.</w:t>
+      </w:r>
+    </w:p>
+    <w:p>
+      <w:pPr>
+        <w:pStyle w:val="ListBullet"/>
+        <w:spacing w:before="20" w:after="40" w:line="276" w:lineRule="auto"/>
+      </w:pPr>
+      <w:r>
+        <w:rPr>
+          <w:rFonts w:ascii="Calibri" w:hAnsi="Calibri"/>
+          <w:color w:val="1E293B"/>
+          <w:sz w:val="20"/>
+        </w:rPr>
+        <w:t xml:space="preserve">Dedicated </w:t>
+      </w:r>
+      <w:r>
+        <w:rPr>
+          <w:rFonts w:ascii="Calibri" w:hAnsi="Calibri"/>
+          <w:b/>
+          <w:color w:val="1E293B"/>
+          <w:sz w:val="20"/>
+        </w:rPr>
+        <w:t>Export CSV</w:t>
+      </w:r>
+      <w:r>
+        <w:rPr>
+          <w:rFonts w:ascii="Calibri" w:hAnsi="Calibri"/>
+          <w:color w:val="1E293B"/>
+          <w:sz w:val="20"/>
+        </w:rPr>
+        <w:t xml:space="preserve"> button downloads the widget's underlying aggregated records directly.</w:t>
+      </w:r>
+    </w:p>
+    <w:p>
+      <w:pPr>
+        <w:pStyle w:val="ListBullet"/>
+        <w:spacing w:before="20" w:after="40" w:line="276" w:lineRule="auto"/>
+      </w:pPr>
+      <w:r>
+        <w:rPr>
+          <w:rFonts w:ascii="Calibri" w:hAnsi="Calibri"/>
+          <w:color w:val="1E293B"/>
+          <w:sz w:val="20"/>
+        </w:rPr>
+      </w:r>
+      <w:r>
+        <w:rPr>
+          <w:rFonts w:ascii="Calibri" w:hAnsi="Calibri"/>
+          <w:b/>
+          <w:color w:val="1E293B"/>
+          <w:sz w:val="20"/>
+        </w:rPr>
+        <w:t>Keyboard &amp; Close Controls</w:t>
+      </w:r>
+      <w:r>
+        <w:rPr>
+          <w:rFonts w:ascii="Calibri" w:hAnsi="Calibri"/>
+          <w:color w:val="1E293B"/>
+          <w:sz w:val="20"/>
+        </w:rPr>
+        <w:t>:</w:t>
+      </w:r>
+    </w:p>
+    <w:p>
+      <w:pPr>
+        <w:pStyle w:val="ListBullet"/>
+        <w:spacing w:before="20" w:after="40" w:line="276" w:lineRule="auto"/>
+      </w:pPr>
+      <w:r>
+        <w:rPr>
+          <w:rFonts w:ascii="Calibri" w:hAnsi="Calibri"/>
+          <w:color w:val="1E293B"/>
+          <w:sz w:val="20"/>
+        </w:rPr>
+        <w:t>Pressing ESC, clicking the minimize button, or clicking the backdrop overlay smoothly returns to the exact dashboard view.</w:t>
+      </w:r>
+    </w:p>
+    <w:p>
+      <w:pPr>
+        <w:pStyle w:val="ListBullet"/>
+        <w:spacing w:before="20" w:after="40" w:line="276" w:lineRule="auto"/>
+      </w:pPr>
+      <w:r>
+        <w:rPr>
+          <w:rFonts w:ascii="Calibri" w:hAnsi="Calibri"/>
+          <w:color w:val="1E293B"/>
+          <w:sz w:val="20"/>
+        </w:rPr>
+      </w:r>
+      <w:r>
+        <w:rPr>
+          <w:rFonts w:ascii="Calibri" w:hAnsi="Calibri"/>
+          <w:b/>
+          <w:color w:val="1E293B"/>
+          <w:sz w:val="20"/>
+        </w:rPr>
+        <w:t>In-Card Grid Width Selection Preserved</w:t>
+      </w:r>
+      <w:r>
+        <w:rPr>
+          <w:rFonts w:ascii="Calibri" w:hAnsi="Calibri"/>
+          <w:color w:val="1E293B"/>
+          <w:sz w:val="20"/>
+        </w:rPr>
+        <w:t>:</w:t>
+      </w:r>
+    </w:p>
+    <w:p>
+      <w:pPr>
+        <w:pStyle w:val="ListBullet"/>
+        <w:spacing w:before="20" w:after="40" w:line="276" w:lineRule="auto"/>
+      </w:pPr>
+      <w:r>
+        <w:rPr>
+          <w:rFonts w:ascii="Calibri" w:hAnsi="Calibri"/>
+          <w:color w:val="1E293B"/>
+          <w:sz w:val="20"/>
+        </w:rPr>
+        <w:t>Users can also adjust individual grid card widths directly on the dashboard (1/4, 1/3, 1/2, 2/3, Full Span 12) via the card options dropdown.</w:t>
       </w:r>
     </w:p>
     <w:p>

</xml_diff>

<commit_message>
feat: show full-density data labels on expanded zoom charts with collision guardrail
</commit_message>
<xml_diff>
--- a/OmniDash_Email_Package/OmniDash_Executive_User_Guide.docx
+++ b/OmniDash_Email_Package/OmniDash_Executive_User_Guide.docx
@@ -5409,6 +5409,112 @@
           <w:sz w:val="20"/>
         </w:rPr>
         <w:t xml:space="preserve"> button downloads the widget's underlying aggregated records directly.</w:t>
+      </w:r>
+    </w:p>
+    <w:p>
+      <w:pPr>
+        <w:pStyle w:val="ListBullet"/>
+        <w:spacing w:before="20" w:after="40" w:line="276" w:lineRule="auto"/>
+      </w:pPr>
+      <w:r>
+        <w:rPr>
+          <w:rFonts w:ascii="Calibri" w:hAnsi="Calibri"/>
+          <w:color w:val="1E293B"/>
+          <w:sz w:val="20"/>
+        </w:rPr>
+      </w:r>
+      <w:r>
+        <w:rPr>
+          <w:rFonts w:ascii="Calibri" w:hAnsi="Calibri"/>
+          <w:b/>
+          <w:color w:val="1E293B"/>
+          <w:sz w:val="20"/>
+        </w:rPr>
+        <w:t>Full-Density Data Labels with Smart Anti-Collision Guardrail</w:t>
+      </w:r>
+      <w:r>
+        <w:rPr>
+          <w:rFonts w:ascii="Calibri" w:hAnsi="Calibri"/>
+          <w:color w:val="1E293B"/>
+          <w:sz w:val="20"/>
+        </w:rPr>
+        <w:t>:</w:t>
+      </w:r>
+    </w:p>
+    <w:p>
+      <w:pPr>
+        <w:pStyle w:val="ListBullet"/>
+        <w:spacing w:before="20" w:after="40" w:line="276" w:lineRule="auto"/>
+      </w:pPr>
+      <w:r>
+        <w:rPr>
+          <w:rFonts w:ascii="Calibri" w:hAnsi="Calibri"/>
+          <w:color w:val="1E293B"/>
+          <w:sz w:val="20"/>
+        </w:rPr>
+        <w:t>In standard dashboard grid cards, OmniDash applies smart density throttling to keep compact tiles clean and decluttered.</w:t>
+      </w:r>
+    </w:p>
+    <w:p>
+      <w:pPr>
+        <w:pStyle w:val="ListBullet"/>
+        <w:spacing w:before="20" w:after="40" w:line="276" w:lineRule="auto"/>
+      </w:pPr>
+      <w:r>
+        <w:rPr>
+          <w:rFonts w:ascii="Calibri" w:hAnsi="Calibri"/>
+          <w:color w:val="1E293B"/>
+          <w:sz w:val="20"/>
+        </w:rPr>
+        <w:t xml:space="preserve">When opened in the </w:t>
+      </w:r>
+      <w:r>
+        <w:rPr>
+          <w:rFonts w:ascii="Calibri" w:hAnsi="Calibri"/>
+          <w:b/>
+          <w:color w:val="1E293B"/>
+          <w:sz w:val="20"/>
+        </w:rPr>
+        <w:t>Spotlight Zoom Lightbox</w:t>
+      </w:r>
+      <w:r>
+        <w:rPr>
+          <w:rFonts w:ascii="Calibri" w:hAnsi="Calibri"/>
+          <w:color w:val="1E293B"/>
+          <w:sz w:val="20"/>
+        </w:rPr>
+        <w:t>, the engine automatically activates full data label density, displaying exact values atop every bar or line point across the widescreen canvas.</w:t>
+      </w:r>
+    </w:p>
+    <w:p>
+      <w:pPr>
+        <w:pStyle w:val="ListBullet"/>
+        <w:spacing w:before="20" w:after="40" w:line="276" w:lineRule="auto"/>
+      </w:pPr>
+      <w:r>
+        <w:rPr>
+          <w:rFonts w:ascii="Calibri" w:hAnsi="Calibri"/>
+          <w:color w:val="1E293B"/>
+          <w:sz w:val="20"/>
+        </w:rPr>
+        <w:t xml:space="preserve">If a dataset is exceptionally dense (e.g., 60–100+ categories) where text would physically overlap, the pixel bounding-box collision guardrail gracefully suppresses only the colliding labels, while mouseover tooltips and the </w:t>
+      </w:r>
+      <w:r>
+        <w:rPr>
+          <w:rFonts w:ascii="Calibri" w:hAnsi="Calibri"/>
+          <w:b/>
+          <w:color w:val="1E293B"/>
+          <w:sz w:val="20"/>
+        </w:rPr>
+        <w:t>Underlying Data Table</w:t>
+      </w:r>
+      <w:r>
+        <w:rPr>
+          <w:rFonts w:ascii="Calibri" w:hAnsi="Calibri"/>
+          <w:color w:val="1E293B"/>
+          <w:sz w:val="20"/>
+        </w:rPr>
+        <w:t xml:space="preserve"> tab provide instantaneous access to every exact figure.</w:t>
       </w:r>
     </w:p>
     <w:p>

</xml_diff>